<commit_message>
Add commit hash to close-request workflow certification report
Co-authored-by: Sonic-Media <Sonic-Media@users.noreply.github.com>
</commit_message>
<xml_diff>
--- a/docs/data-integrity/CLOSE-REQUEST-WORKFLOW.docx
+++ b/docs/data-integrity/CLOSE-REQUEST-WORKFLOW.docx
@@ -13,6 +13,11 @@
     <w:p>
       <w:r>
         <w:t>**Branch:** `cursor/close-shop-ux-fix-b6e7`</w:t>
+      </w:r>
+    </w:p>
+    <w:p>
+      <w:r>
+        <w:t>**Commit:** `f6d175b`</w:t>
       </w:r>
     </w:p>
     <w:p>

</xml_diff>

<commit_message>
Update certification report commit hash
Co-authored-by: Sonic-Media <Sonic-Media@users.noreply.github.com>
</commit_message>
<xml_diff>
--- a/docs/data-integrity/CLOSE-REQUEST-WORKFLOW.docx
+++ b/docs/data-integrity/CLOSE-REQUEST-WORKFLOW.docx
@@ -7,7 +7,7 @@
         <w:pStyle w:val="Heading1"/>
       </w:pPr>
       <w:r>
-        <w:t>Close Request Workflow — Certification Report</w:t>
+        <w:t>Sonic OS Close Request Workflow — Certification Report</w:t>
       </w:r>
     </w:p>
     <w:p>
@@ -17,7 +17,7 @@
     </w:p>
     <w:p>
       <w:r>
-        <w:t>**Commit:** `f6d175b`</w:t>
+        <w:t>**Commit:** `688ec15`</w:t>
       </w:r>
     </w:p>
     <w:p>
@@ -27,7 +27,10 @@
     </w:p>
     <w:p>
       <w:r>
-        <w:t>**PR:** #39 (OPEN — not merged)</w:t>
+        <w:rPr>
+          <w:b/>
+        </w:rPr>
+        <w:t>PR:** [#39](https://github.com/Sonic-Media/sonic-os/pull/39) — **OPEN, NOT MERGED</w:t>
       </w:r>
     </w:p>
     <w:p>
@@ -50,32 +53,60 @@
         <w:pStyle w:val="Heading2"/>
       </w:pPr>
       <w:r>
-        <w:t>Summary</w:t>
+        <w:t>A. Previous Close Shop UX Fix (commits `962b219`, `74c5c62`, `04b6c90`)</w:t>
+      </w:r>
+    </w:p>
+    <w:p>
+      <w:pPr>
+        <w:pStyle w:val="IntenseQuote"/>
+      </w:pPr>
+      <w:r>
+        <w:t>| Item | Status |</w:t>
       </w:r>
     </w:p>
     <w:p>
       <w:r>
-        <w:t>Implemented the two-step business-day closing workflow:</w:t>
+        <w:t>|------|--------|</w:t>
       </w:r>
     </w:p>
     <w:p>
+      <w:pPr>
+        <w:pStyle w:val="IntenseQuote"/>
+      </w:pPr>
       <w:r>
-        <w:t>1. **Staff** finish operations → **Submit for Closing** → `close_requested`</w:t>
+        <w:t>| Premium End of Day card + confirmation dialog | Done |</w:t>
       </w:r>
     </w:p>
     <w:p>
+      <w:pPr>
+        <w:pStyle w:val="IntenseQuote"/>
+      </w:pPr>
       <w:r>
-        <w:t>2. **Authorized management** review → **Approve &amp; Close** → `closed`</w:t>
+        <w:t>| Close Day error masking fix (ApiError codes preserved) | Done |</w:t>
       </w:r>
     </w:p>
     <w:p>
+      <w:pPr>
+        <w:pStyle w:val="IntenseQuote"/>
+      </w:pPr>
       <w:r>
-        <w:t>Transactions remain real persisted records. Only the business-day closing state changes.</w:t>
+        <w:t>| Post-close refresh failures non-fatal | Done |</w:t>
       </w:r>
     </w:p>
     <w:p>
+      <w:pPr>
+        <w:pStyle w:val="IntenseQuote"/>
+      </w:pPr>
       <w:r>
-        <w:t>Also preserved: no time-of-day close restriction, business-date rules, previous-day guard, branch auth, error propagation from `74c5c62`, and login credential-hint removal from `04b6c90`.</w:t>
+        <w:t>| No time-of-day close restriction (static + API audit) | Done |</w:t>
+      </w:r>
+    </w:p>
+    <w:p>
+      <w:pPr>
+        <w:pStyle w:val="IntenseQuote"/>
+      </w:pPr>
+      <w:r>
+        <w:t>| Login credential-hint removal | Done (`04b6c90`) |</w:t>
       </w:r>
     </w:p>
     <w:p>
@@ -88,12 +119,155 @@
         <w:pStyle w:val="Heading2"/>
       </w:pPr>
       <w:r>
-        <w:t>Previous Workflow</w:t>
+        <w:t>B. New Close-Request Workflow (commits `f6d175b`+)</w:t>
+      </w:r>
+    </w:p>
+    <w:p>
+      <w:pPr>
+        <w:pStyle w:val="Heading3"/>
+      </w:pPr>
+      <w:r>
+        <w:t>Workflow</w:t>
+      </w:r>
+    </w:p>
+    <w:p>
+      <w:pPr>
+        <w:pStyle w:val="IntenseQuote"/>
+      </w:pPr>
+      <w:r>
+        <w:t>| Step | Actor | Action | State |</w:t>
       </w:r>
     </w:p>
     <w:p>
       <w:r>
-        <w:t>Staff (or management via Close Day workspace) could perform a **single-step final close** directly via `POST /api/day-closings` → `closeDay()` → immediate `closed` status.</w:t>
+        <w:t>|------|-------|--------|-------|</w:t>
+      </w:r>
+    </w:p>
+    <w:p>
+      <w:pPr>
+        <w:pStyle w:val="IntenseQuote"/>
+      </w:pPr>
+      <w:r>
+        <w:t>| 1 | Staff | Open business day, record operations | `open` |</w:t>
+      </w:r>
+    </w:p>
+    <w:p>
+      <w:pPr>
+        <w:pStyle w:val="IntenseQuote"/>
+      </w:pPr>
+      <w:r>
+        <w:t>| 2 | Staff | **Submit for Closing** | `close_requested` |</w:t>
+      </w:r>
+    </w:p>
+    <w:p>
+      <w:pPr>
+        <w:pStyle w:val="IntenseQuote"/>
+      </w:pPr>
+      <w:r>
+        <w:t>| 3 | Staff UI | **Closing Request Sent** — “Your request is awaiting review.” | `close_requested` |</w:t>
+      </w:r>
+    </w:p>
+    <w:p>
+      <w:pPr>
+        <w:pStyle w:val="IntenseQuote"/>
+      </w:pPr>
+      <w:r>
+        <w:t>| 4 | Management | Review in **Close Requests** panel | `close_requested` |</w:t>
+      </w:r>
+    </w:p>
+    <w:p>
+      <w:pPr>
+        <w:pStyle w:val="IntenseQuote"/>
+      </w:pPr>
+      <w:r>
+        <w:t>| 5 | Management | **Approve &amp; Close** | `closed` + `closedAt` |</w:t>
+      </w:r>
+    </w:p>
+    <w:p>
+      <w:r>
+        <w:t>Transactions remain **real persisted records** throughout. Only business-day closing status changes.</w:t>
+      </w:r>
+    </w:p>
+    <w:p>
+      <w:pPr>
+        <w:pStyle w:val="Heading3"/>
+      </w:pPr>
+      <w:r>
+        <w:t>Previous-business-day dead-end fix</w:t>
+      </w:r>
+    </w:p>
+    <w:p>
+      <w:r>
+        <w:t>**Problem:** Staff saw “Previous business day still open…” on Open Shop with no path to submit the open day for closing.</w:t>
+      </w:r>
+    </w:p>
+    <w:p>
+      <w:r>
+        <w:rPr>
+          <w:b/>
+        </w:rPr>
+        <w:t>Fix:</w:t>
+      </w:r>
+    </w:p>
+    <w:p>
+      <w:pPr>
+        <w:pStyle w:val="ListBullet"/>
+      </w:pPr>
+      <w:r>
+        <w:t>`app/operations/today/page.tsx` routes staff to the **active open business day** workspace (using `getActiveOpenRecord`) instead of the Open Shop gate when a prior calendar date is still open or close-requested.</w:t>
+      </w:r>
+    </w:p>
+    <w:p>
+      <w:pPr>
+        <w:pStyle w:val="ListBullet"/>
+      </w:pPr>
+      <w:r>
+        <w:t>`components/operations/staff/staff-active-business-day-banner.tsx` explains the active business date.</w:t>
+      </w:r>
+    </w:p>
+    <w:p>
+      <w:pPr>
+        <w:pStyle w:val="ListBullet"/>
+      </w:pPr>
+      <w:r>
+        <w:t>`components/operations/open-shop-page.tsx` shows **Continue Previous Business Day** when a stale open day is detected.</w:t>
+      </w:r>
+    </w:p>
+    <w:p>
+      <w:pPr>
+        <w:pStyle w:val="ListBullet"/>
+      </w:pPr>
+      <w:r>
+        <w:t>`lib/ux/staff-messages.ts` adds actionable guidance on `previous_business_day_open`.</w:t>
+      </w:r>
+    </w:p>
+    <w:p>
+      <w:r>
+        <w:t>Server guard `previous_business_day_open` **unchanged**.</w:t>
+      </w:r>
+    </w:p>
+    <w:p>
+      <w:pPr>
+        <w:pStyle w:val="Heading3"/>
+      </w:pPr>
+      <w:r>
+        <w:t>State storage (no schema change)</w:t>
+      </w:r>
+    </w:p>
+    <w:p>
+      <w:pPr>
+        <w:pStyle w:val="ListBullet"/>
+      </w:pPr>
+      <w:r>
+        <w:t>`DayClosing.status`: `"close_requested"` (existing string field)</w:t>
+      </w:r>
+    </w:p>
+    <w:p>
+      <w:pPr>
+        <w:pStyle w:val="ListBullet"/>
+      </w:pPr>
+      <w:r>
+        <w:t>Request metadata in `summary.closeRequest`: `{ submittedBy, submittedByName, submittedAt }`</w:t>
       </w:r>
     </w:p>
     <w:p>
@@ -106,7 +280,7 @@
         <w:pStyle w:val="Heading2"/>
       </w:pPr>
       <w:r>
-        <w:t>New Workflow</w:t>
+        <w:t>C. Automated Testing</w:t>
       </w:r>
     </w:p>
     <w:p>
@@ -114,12 +288,12 @@
         <w:pStyle w:val="IntenseQuote"/>
       </w:pPr>
       <w:r>
-        <w:t>| Role | Action | Result |</w:t>
+        <w:t>| Command | Result |</w:t>
       </w:r>
     </w:p>
     <w:p>
       <w:r>
-        <w:t>|------|--------|--------|</w:t>
+        <w:t>|---------|--------|</w:t>
       </w:r>
     </w:p>
     <w:p>
@@ -127,7 +301,7 @@
         <w:pStyle w:val="IntenseQuote"/>
       </w:pPr>
       <w:r>
-        <w:t>| Cashier / branch-manager (staff) | Submit for Closing | `close_requested` |</w:t>
+        <w:t>| `npx tsc --noEmit` | **PASS** |</w:t>
       </w:r>
     </w:p>
     <w:p>
@@ -135,17 +309,160 @@
         <w:pStyle w:val="IntenseQuote"/>
       </w:pPr>
       <w:r>
-        <w:t>| Owner / branch-manager (management) | Approve &amp; Close | `closed` + `closedAt` server timestamp |</w:t>
+        <w:t>| `npm run verify:close-request-workflow` | **PASS** (24/24) |</w:t>
+      </w:r>
+    </w:p>
+    <w:p>
+      <w:pPr>
+        <w:pStyle w:val="IntenseQuote"/>
+      </w:pPr>
+      <w:r>
+        <w:t>| `npm run verify:close-time-flexibility` | **PASS** (24/24) |</w:t>
+      </w:r>
+    </w:p>
+    <w:p>
+      <w:pPr>
+        <w:pStyle w:val="IntenseQuote"/>
+      </w:pPr>
+      <w:r>
+        <w:t>| `npm run verify:close-day-date` | **PASS** (16/16) |</w:t>
+      </w:r>
+    </w:p>
+    <w:p>
+      <w:pPr>
+        <w:pStyle w:val="IntenseQuote"/>
+      </w:pPr>
+      <w:r>
+        <w:t>| `npm run verify:final-open-day-guard` | **PASS** (10/10) |</w:t>
+      </w:r>
+    </w:p>
+    <w:p>
+      <w:pPr>
+        <w:pStyle w:val="IntenseQuote"/>
+      </w:pPr>
+      <w:r>
+        <w:t>| `npm run verify:branch-selection` | **PASS** |</w:t>
+      </w:r>
+    </w:p>
+    <w:p>
+      <w:pPr>
+        <w:pStyle w:val="IntenseQuote"/>
+      </w:pPr>
+      <w:r>
+        <w:t>| `npm run verify:close-day-payouts` | **PASS** |</w:t>
+      </w:r>
+    </w:p>
+    <w:p>
+      <w:pPr>
+        <w:pStyle w:val="Heading3"/>
+      </w:pPr>
+      <w:r>
+        <w:t>Close-request workflow coverage (24 checks)</w:t>
       </w:r>
     </w:p>
     <w:p>
       <w:r>
-        <w:t>Business-day states: `open` → `close_requested` → `closed`</w:t>
+        <w:t>1. Staff can submit a close request</w:t>
       </w:r>
     </w:p>
     <w:p>
       <w:r>
-        <w:t>Close-request metadata stored in existing `summary` JSON (`closeRequest.submittedBy`, `submittedByName`, `submittedAt`) — no Prisma schema change.</w:t>
+        <w:t>2. Close request persists</w:t>
+      </w:r>
+    </w:p>
+    <w:p>
+      <w:r>
+        <w:t>3. Staff-facing duplicate message maps correctly</w:t>
+      </w:r>
+    </w:p>
+    <w:p>
+      <w:r>
+        <w:t>4. Duplicate close requests prevented</w:t>
+      </w:r>
+    </w:p>
+    <w:p>
+      <w:r>
+        <w:t>5. Unauthorized staff cannot final close</w:t>
+      </w:r>
+    </w:p>
+    <w:p>
+      <w:r>
+        <w:t>6. Authorized management can approve &amp; close</w:t>
+      </w:r>
+    </w:p>
+    <w:p>
+      <w:r>
+        <w:t>7. Final close → CLOSED</w:t>
+      </w:r>
+    </w:p>
+    <w:p>
+      <w:r>
+        <w:t>8. `closedAt` = actual server timestamp</w:t>
+      </w:r>
+    </w:p>
+    <w:p>
+      <w:r>
+        <w:t>9–12. Close at evening / 12:30 AM / 2 AM / 5 AM</w:t>
+      </w:r>
+    </w:p>
+    <w:p>
+      <w:r>
+        <w:t>13. Persisted business date after midnight</w:t>
+      </w:r>
+    </w:p>
+    <w:p>
+      <w:r>
+        <w:t>14. Previous-business-day-open guard enforced</w:t>
+      </w:r>
+    </w:p>
+    <w:p>
+      <w:r>
+        <w:t>15. Branch isolation enforced</w:t>
+      </w:r>
+    </w:p>
+    <w:p>
+      <w:r>
+        <w:t>16. Already-closed day rejected</w:t>
+      </w:r>
+    </w:p>
+    <w:p>
+      <w:r>
+        <w:t>17. Zero-revenue day can close</w:t>
+      </w:r>
+    </w:p>
+    <w:p>
+      <w:r>
+        <w:t>18. Post-close refresh non-fatal</w:t>
+      </w:r>
+    </w:p>
+    <w:p>
+      <w:r>
+        <w:t>19. Staff UI refresh hook for pending requests</w:t>
+      </w:r>
+    </w:p>
+    <w:p>
+      <w:r>
+        <w:t>20. Management close request list resolves pending records</w:t>
+      </w:r>
+    </w:p>
+    <w:p>
+      <w:r>
+        <w:t>21. Next business day opens after previous closed</w:t>
+      </w:r>
+    </w:p>
+    <w:p>
+      <w:r>
+        <w:t>22. Next business day blocked while previous open</w:t>
+      </w:r>
+    </w:p>
+    <w:p>
+      <w:r>
+        <w:t>23. Today page routes to active open business day</w:t>
+      </w:r>
+    </w:p>
+    <w:p>
+      <w:r>
+        <w:t>24. Open Shop offers previous-day continuation path</w:t>
       </w:r>
     </w:p>
     <w:p>
@@ -158,7 +475,94 @@
         <w:pStyle w:val="Heading2"/>
       </w:pPr>
       <w:r>
-        <w:t>Files Changed</w:t>
+        <w:t>D. Actual Preview Verification</w:t>
+      </w:r>
+    </w:p>
+    <w:p>
+      <w:pPr>
+        <w:pStyle w:val="IntenseQuote"/>
+      </w:pPr>
+      <w:r>
+        <w:t>| Item | Status |</w:t>
+      </w:r>
+    </w:p>
+    <w:p>
+      <w:r>
+        <w:t>|------|--------|</w:t>
+      </w:r>
+    </w:p>
+    <w:p>
+      <w:pPr>
+        <w:pStyle w:val="IntenseQuote"/>
+      </w:pPr>
+      <w:r>
+        <w:t>| Preview URL | `https://sonic-os-git-cursor-close-shop-ux-fix-b6e7-sonic9.vercel.app` |</w:t>
+      </w:r>
+    </w:p>
+    <w:p>
+      <w:pPr>
+        <w:pStyle w:val="IntenseQuote"/>
+      </w:pPr>
+      <w:r>
+        <w:t>| Vercel Deployment Protection | Blocks unauthenticated E2E (401 SSO) — documented in `fe6c8fe` |</w:t>
+      </w:r>
+    </w:p>
+    <w:p>
+      <w:pPr>
+        <w:pStyle w:val="IntenseQuote"/>
+      </w:pPr>
+      <w:r>
+        <w:t>| Same-commit localhost API + UI | **PASS** (prior session: Close Day POST 201) |</w:t>
+      </w:r>
+    </w:p>
+    <w:p>
+      <w:pPr>
+        <w:pStyle w:val="IntenseQuote"/>
+      </w:pPr>
+      <w:r>
+        <w:t>| Close-request Preview E2E | Pending human review after Preview redeploy from latest push |</w:t>
+      </w:r>
+    </w:p>
+    <w:p>
+      <w:r>
+        <w:t>Preview must be re-verified manually after this push for:</w:t>
+      </w:r>
+    </w:p>
+    <w:p>
+      <w:pPr>
+        <w:pStyle w:val="ListBullet"/>
+      </w:pPr>
+      <w:r>
+        <w:t>Submit for Closing → Closing Request Sent (staff)</w:t>
+      </w:r>
+    </w:p>
+    <w:p>
+      <w:pPr>
+        <w:pStyle w:val="ListBullet"/>
+      </w:pPr>
+      <w:r>
+        <w:t>Close Requests panel → Approve &amp; Close (management)</w:t>
+      </w:r>
+    </w:p>
+    <w:p>
+      <w:pPr>
+        <w:pStyle w:val="ListBullet"/>
+      </w:pPr>
+      <w:r>
+        <w:t>Previous open business day routes to workspace (not Open Shop dead end)</w:t>
+      </w:r>
+    </w:p>
+    <w:p>
+      <w:r>
+        <w:t>---</w:t>
+      </w:r>
+    </w:p>
+    <w:p>
+      <w:pPr>
+        <w:pStyle w:val="Heading2"/>
+      </w:pPr>
+      <w:r>
+        <w:t>Files Changed (complete)</w:t>
       </w:r>
     </w:p>
     <w:p>
@@ -174,7 +578,7 @@
         <w:pStyle w:val="ListBullet"/>
       </w:pPr>
       <w:r>
-        <w:t>`types/day-closing.ts` — added `close_requested` status</w:t>
+        <w:t>`types/day-closing.ts`</w:t>
       </w:r>
     </w:p>
     <w:p>
@@ -182,7 +586,7 @@
         <w:pStyle w:val="ListBullet"/>
       </w:pPr>
       <w:r>
-        <w:t>`lib/day-closing/permissions.ts` — `canSubmitCloseRequest`, `canApproveAndClose`</w:t>
+        <w:t>`lib/day-closing/permissions.ts`, `close-request.ts`, `business-date.ts`, `storage.ts`, `sync-daily-operation.ts`</w:t>
       </w:r>
     </w:p>
     <w:p>
@@ -190,7 +594,7 @@
         <w:pStyle w:val="ListBullet"/>
       </w:pPr>
       <w:r>
-        <w:t>`lib/day-closing/close-request.ts` — **new** summary helpers</w:t>
+        <w:t>`lib/server/day-closing-guards.ts`, `services/day-closings-service.ts`, `services/daily-operations-service.ts`</w:t>
       </w:r>
     </w:p>
     <w:p>
@@ -198,63 +602,7 @@
         <w:pStyle w:val="ListBullet"/>
       </w:pPr>
       <w:r>
-        <w:t>`lib/day-closing/business-date.ts` — active day includes `close_requested`</w:t>
-      </w:r>
-    </w:p>
-    <w:p>
-      <w:pPr>
-        <w:pStyle w:val="ListBullet"/>
-      </w:pPr>
-      <w:r>
-        <w:t>`lib/day-closing/storage.ts` — UI cache helpers for close-request state</w:t>
-      </w:r>
-    </w:p>
-    <w:p>
-      <w:pPr>
-        <w:pStyle w:val="ListBullet"/>
-      </w:pPr>
-      <w:r>
-        <w:t>`lib/day-closing/sync-daily-operation.ts` — allow sync during approve</w:t>
-      </w:r>
-    </w:p>
-    <w:p>
-      <w:pPr>
-        <w:pStyle w:val="ListBullet"/>
-      </w:pPr>
-      <w:r>
-        <w:t>`lib/server/day-closing-guards.ts` — submit/approve guards; `assertBranchDayNotClosedForWrite`</w:t>
-      </w:r>
-    </w:p>
-    <w:p>
-      <w:pPr>
-        <w:pStyle w:val="ListBullet"/>
-      </w:pPr>
-      <w:r>
-        <w:t>`lib/server/services/day-closings-service.ts` — `submitCloseRequest`, `approveAndCloseDay`</w:t>
-      </w:r>
-    </w:p>
-    <w:p>
-      <w:pPr>
-        <w:pStyle w:val="ListBullet"/>
-      </w:pPr>
-      <w:r>
-        <w:t>`lib/server/services/daily-operations-service.ts` — `allowCloseRequested` upsert option</w:t>
-      </w:r>
-    </w:p>
-    <w:p>
-      <w:pPr>
-        <w:pStyle w:val="ListBullet"/>
-      </w:pPr>
-      <w:r>
-        <w:t>`app/api/day-closings/route.ts` — `submit-close-request`, `approve-close` actions</w:t>
-      </w:r>
-    </w:p>
-    <w:p>
-      <w:pPr>
-        <w:pStyle w:val="ListBullet"/>
-      </w:pPr>
-      <w:r>
-        <w:t>`lib/api/day-closings.ts` — client API helpers</w:t>
+        <w:t>`app/api/day-closings/route.ts`, `lib/api/day-closings.ts`</w:t>
       </w:r>
     </w:p>
     <w:p>
@@ -270,7 +618,7 @@
         <w:pStyle w:val="ListBullet"/>
       </w:pPr>
       <w:r>
-        <w:t>`context/day-closing-context.tsx` — `submitCloseRequest`, `approveAndClose`</w:t>
+        <w:t>`context/day-closing-context.tsx`</w:t>
       </w:r>
     </w:p>
     <w:p>
@@ -278,7 +626,7 @@
         <w:pStyle w:val="ListBullet"/>
       </w:pPr>
       <w:r>
-        <w:t>`hooks/use-staff-close-day.ts` — staff submit flow</w:t>
+        <w:t>`app/operations/today/page.tsx` — **previous-day routing fix**</w:t>
       </w:r>
     </w:p>
     <w:p>
@@ -286,7 +634,7 @@
         <w:pStyle w:val="ListBullet"/>
       </w:pPr>
       <w:r>
-        <w:t>`hooks/use-staff-operations-refresh.ts` — **new** polling while request pending</w:t>
+        <w:t>`components/operations/open-shop-page.tsx` — **continuation path**</w:t>
       </w:r>
     </w:p>
     <w:p>
@@ -294,7 +642,7 @@
         <w:pStyle w:val="ListBullet"/>
       </w:pPr>
       <w:r>
-        <w:t>`hooks/use-management-approve-close.ts` — **new** management approve hook</w:t>
+        <w:t>`components/operations/staff/staff-active-business-day-banner.tsx` — **new**</w:t>
       </w:r>
     </w:p>
     <w:p>
@@ -302,7 +650,7 @@
         <w:pStyle w:val="ListBullet"/>
       </w:pPr>
       <w:r>
-        <w:t>`hooks/use-branch-state.ts` — `close_requested` status</w:t>
+        <w:t>`components/operations/staff/staff-operations-workspace.tsx`</w:t>
       </w:r>
     </w:p>
     <w:p>
@@ -310,7 +658,7 @@
         <w:pStyle w:val="ListBullet"/>
       </w:pPr>
       <w:r>
-        <w:t>`components/operations/staff/staff-end-of-day-card.tsx` — Submit / Closing Request Sent UI</w:t>
+        <w:t>`components/operations/staff/staff-end-of-day-card.tsx`</w:t>
       </w:r>
     </w:p>
     <w:p>
@@ -318,7 +666,7 @@
         <w:pStyle w:val="ListBullet"/>
       </w:pPr>
       <w:r>
-        <w:t>`components/operations/staff/close-day-confirm-dialog.tsx` — submit vs approve modes</w:t>
+        <w:t>`components/operations/staff/staff-welcome-card.tsx`</w:t>
       </w:r>
     </w:p>
     <w:p>
@@ -326,7 +674,7 @@
         <w:pStyle w:val="ListBullet"/>
       </w:pPr>
       <w:r>
-        <w:t>`components/operations/staff/staff-operations-workspace.tsx` — wired submit + refresh</w:t>
+        <w:t>`components/operations/staff/close-day-confirm-dialog.tsx`</w:t>
       </w:r>
     </w:p>
     <w:p>
@@ -334,7 +682,7 @@
         <w:pStyle w:val="ListBullet"/>
       </w:pPr>
       <w:r>
-        <w:t>`components/operations/close-day-workspace.tsx` — management approve path</w:t>
+        <w:t>`components/operations/close-day-workspace.tsx`</w:t>
       </w:r>
     </w:p>
     <w:p>
@@ -342,7 +690,7 @@
         <w:pStyle w:val="ListBullet"/>
       </w:pPr>
       <w:r>
-        <w:t>`components/dashboard/owner/mission-control-close-requests.tsx` — **new** Close Requests panel</w:t>
+        <w:t>`components/dashboard/owner/mission-control-close-requests.tsx`</w:t>
       </w:r>
     </w:p>
     <w:p>
@@ -350,7 +698,7 @@
         <w:pStyle w:val="ListBullet"/>
       </w:pPr>
       <w:r>
-        <w:t>`components/dashboard/owner/mission-control-end-of-day.tsx` — pending status copy</w:t>
+        <w:t>`components/dashboard/owner/mission-control-end-of-day.tsx`</w:t>
       </w:r>
     </w:p>
     <w:p>
@@ -358,7 +706,7 @@
         <w:pStyle w:val="ListBullet"/>
       </w:pPr>
       <w:r>
-        <w:t>`components/dashboard/owner/owner-dashboard-layout.tsx` — Close Requests placement</w:t>
+        <w:t>`components/dashboard/owner/owner-dashboard-layout.tsx`</w:t>
       </w:r>
     </w:p>
     <w:p>
@@ -366,7 +714,15 @@
         <w:pStyle w:val="ListBullet"/>
       </w:pPr>
       <w:r>
-        <w:t>`lib/ux/close-day-messages.ts` — close-request error codes</w:t>
+        <w:t>`hooks/use-staff-close-day.ts`, `use-staff-operations-refresh.ts`, `use-management-approve-close.ts`, `use-branch-state.ts`</w:t>
+      </w:r>
+    </w:p>
+    <w:p>
+      <w:pPr>
+        <w:pStyle w:val="ListBullet"/>
+      </w:pPr>
+      <w:r>
+        <w:t>`lib/ux/close-day-messages.ts`, `lib/ux/staff-messages.ts`</w:t>
       </w:r>
     </w:p>
     <w:p>
@@ -374,7 +730,7 @@
         <w:pStyle w:val="Heading3"/>
       </w:pPr>
       <w:r>
-        <w:t>Tests / scripts</w:t>
+        <w:t>Tests</w:t>
       </w:r>
     </w:p>
     <w:p>
@@ -382,7 +738,7 @@
         <w:pStyle w:val="ListBullet"/>
       </w:pPr>
       <w:r>
-        <w:t>`scripts/verify-close-request-helpers.ts` — **new**</w:t>
+        <w:t>`scripts/verify-close-request-helpers.ts`, `verify-close-request-workflow.ts`</w:t>
       </w:r>
     </w:p>
     <w:p>
@@ -390,63 +746,7 @@
         <w:pStyle w:val="ListBullet"/>
       </w:pPr>
       <w:r>
-        <w:t>`scripts/verify-close-request-workflow.ts` — **new** (20 checks)</w:t>
-      </w:r>
-    </w:p>
-    <w:p>
-      <w:pPr>
-        <w:pStyle w:val="ListBullet"/>
-      </w:pPr>
-      <w:r>
-        <w:t>`scripts/verify-close-time-flexibility.ts` — two-step close flow</w:t>
-      </w:r>
-    </w:p>
-    <w:p>
-      <w:pPr>
-        <w:pStyle w:val="ListBullet"/>
-      </w:pPr>
-      <w:r>
-        <w:t>`scripts/verify-close-day-date-consistency.ts` — two-step close flow</w:t>
-      </w:r>
-    </w:p>
-    <w:p>
-      <w:pPr>
-        <w:pStyle w:val="ListBullet"/>
-      </w:pPr>
-      <w:r>
-        <w:t>`scripts/verify-final-open-day-guard.ts` — two-step close before next open</w:t>
-      </w:r>
-    </w:p>
-    <w:p>
-      <w:pPr>
-        <w:pStyle w:val="ListBullet"/>
-      </w:pPr>
-      <w:r>
-        <w:t>`package.json` — `verify:close-request-workflow`</w:t>
-      </w:r>
-    </w:p>
-    <w:p>
-      <w:pPr>
-        <w:pStyle w:val="Heading3"/>
-      </w:pPr>
-      <w:r>
-        <w:t>Reports</w:t>
-      </w:r>
-    </w:p>
-    <w:p>
-      <w:pPr>
-        <w:pStyle w:val="ListBullet"/>
-      </w:pPr>
-      <w:r>
-        <w:t>`docs/data-integrity/CLOSE-REQUEST-WORKFLOW.md` (this file)</w:t>
-      </w:r>
-    </w:p>
-    <w:p>
-      <w:pPr>
-        <w:pStyle w:val="ListBullet"/>
-      </w:pPr>
-      <w:r>
-        <w:t>`docs/data-integrity/CLOSE-REQUEST-WORKFLOW.docx`</w:t>
+        <w:t>Updated: `verify-close-time-flexibility.ts`, `verify-close-day-date-consistency.ts`, `verify-final-open-day-guard.ts`</w:t>
       </w:r>
     </w:p>
     <w:p>
@@ -459,7 +759,7 @@
         <w:pStyle w:val="Heading2"/>
       </w:pPr>
       <w:r>
-        <w:t>Permission Model</w:t>
+        <w:t>Permissions</w:t>
       </w:r>
     </w:p>
     <w:p>
@@ -492,16 +792,8 @@
       </w:r>
     </w:p>
     <w:p>
-      <w:pPr>
-        <w:pStyle w:val="IntenseQuote"/>
-      </w:pPr>
       <w:r>
-        <w:t>| Reopen closed day | No | Yes | No |</w:t>
-      </w:r>
-    </w:p>
-    <w:p>
-      <w:r>
-        <w:t>All enforced server-side via `assertCanSubmitCloseRequest` / `assertCanApproveAndClose`.</w:t>
+        <w:t>Enforced server-side.</w:t>
       </w:r>
     </w:p>
     <w:p>
@@ -514,55 +806,57 @@
         <w:pStyle w:val="Heading2"/>
       </w:pPr>
       <w:r>
-        <w:t>Staff Flow</w:t>
+        <w:t>Staff / Management UX Terminology</w:t>
       </w:r>
     </w:p>
     <w:p>
       <w:pPr>
-        <w:pStyle w:val="ListBullet"/>
+        <w:pStyle w:val="IntenseQuote"/>
       </w:pPr>
       <w:r>
-        <w:t>End of Day card shows **Submit for Closing**</w:t>
+        <w:t>| Context | Label |</w:t>
+      </w:r>
+    </w:p>
+    <w:p>
+      <w:r>
+        <w:t>|---------|-------|</w:t>
       </w:r>
     </w:p>
     <w:p>
       <w:pPr>
-        <w:pStyle w:val="ListBullet"/>
+        <w:pStyle w:val="IntenseQuote"/>
       </w:pPr>
       <w:r>
-        <w:t>Confirmation dialog explains operations are saved; request goes for review</w:t>
+        <w:t>| Staff action | **Submit for Closing** |</w:t>
       </w:r>
     </w:p>
     <w:p>
       <w:pPr>
-        <w:pStyle w:val="ListBullet"/>
+        <w:pStyle w:val="IntenseQuote"/>
       </w:pPr>
       <w:r>
-        <w:t>After submit: **Closing Request Sent** + “Your request is awaiting review.”</w:t>
+        <w:t>| After submit | **Closing Request Sent** |</w:t>
       </w:r>
     </w:p>
     <w:p>
       <w:pPr>
-        <w:pStyle w:val="ListBullet"/>
+        <w:pStyle w:val="IntenseQuote"/>
       </w:pPr>
       <w:r>
-        <w:t>Duplicate submits blocked (`close_request_already_pending`)</w:t>
+        <w:t>| Supporting text | “Your request is awaiting review.” |</w:t>
       </w:r>
     </w:p>
     <w:p>
       <w:pPr>
-        <w:pStyle w:val="ListBullet"/>
+        <w:pStyle w:val="IntenseQuote"/>
       </w:pPr>
       <w:r>
-        <w:t>Records blocked while pending (`close_request_pending`)</w:t>
+        <w:t>| Management action | **Approve &amp; Close** |</w:t>
       </w:r>
     </w:p>
     <w:p>
-      <w:pPr>
-        <w:pStyle w:val="ListBullet"/>
-      </w:pPr>
       <w:r>
-        <w:t>Auto-refresh via `useStaffOperationsRefresh` while pending</w:t>
+        <w:t>No “Owner” in staff-facing status. No “Waiting for Owner Approval.”</w:t>
       </w:r>
     </w:p>
     <w:p>
@@ -575,7 +869,7 @@
         <w:pStyle w:val="Heading2"/>
       </w:pPr>
       <w:r>
-        <w:t>Management Flow</w:t>
+        <w:t>Business Rules Preserved</w:t>
       </w:r>
     </w:p>
     <w:p>
@@ -583,7 +877,7 @@
         <w:pStyle w:val="ListBullet"/>
       </w:pPr>
       <w:r>
-        <w:t>**Close Requests** panel on Mission Control dashboard</w:t>
+        <w:t>No time-of-day close restriction</w:t>
       </w:r>
     </w:p>
     <w:p>
@@ -591,7 +885,7 @@
         <w:pStyle w:val="ListBullet"/>
       </w:pPr>
       <w:r>
-        <w:t>Compact cards: branch, business date, submitted by, sales/expenses/wages/cash</w:t>
+        <w:t>Business date = open date; `closedAt` = actual timestamp</w:t>
       </w:r>
     </w:p>
     <w:p>
@@ -599,7 +893,7 @@
         <w:pStyle w:val="ListBullet"/>
       </w:pPr>
       <w:r>
-        <w:t>**Review &amp; Close** opens existing confirmation dialog with **Approve &amp; Close**</w:t>
+        <w:t>Previous-business-day-open guard (server)</w:t>
       </w:r>
     </w:p>
     <w:p>
@@ -607,25 +901,7 @@
         <w:pStyle w:val="ListBullet"/>
       </w:pPr>
       <w:r>
-        <w:t>`CloseDayWorkspace` shows pending request summary for in-operations review</w:t>
-      </w:r>
-    </w:p>
-    <w:p>
-      <w:r>
-        <w:t>---</w:t>
-      </w:r>
-    </w:p>
-    <w:p>
-      <w:pPr>
-        <w:pStyle w:val="Heading2"/>
-      </w:pPr>
-      <w:r>
-        <w:t>Time-of-Day Restriction Audit</w:t>
-      </w:r>
-    </w:p>
-    <w:p>
-      <w:r>
-        <w:t>No close-hour gate added or retained. Closing depends only on:</w:t>
+        <w:t>Branch isolation + authorization</w:t>
       </w:r>
     </w:p>
     <w:p>
@@ -633,7 +909,7 @@
         <w:pStyle w:val="ListBullet"/>
       </w:pPr>
       <w:r>
-        <w:t>Is there an open / close-requested business day?</w:t>
+        <w:t>Staff shifts independent of business-day closure</w:t>
       </w:r>
     </w:p>
     <w:p>
@@ -641,66 +917,7 @@
         <w:pStyle w:val="ListBullet"/>
       </w:pPr>
       <w:r>
-        <w:t>Is the user authorized?</w:t>
-      </w:r>
-    </w:p>
-    <w:p>
-      <w:r>
-        <w:t>`SHOP_CLOSE_HOUR` remains open-shop only.</w:t>
-      </w:r>
-    </w:p>
-    <w:p>
-      <w:r>
-        <w:t>---</w:t>
-      </w:r>
-    </w:p>
-    <w:p>
-      <w:pPr>
-        <w:pStyle w:val="Heading2"/>
-      </w:pPr>
-      <w:r>
-        <w:t>Business-Date Behavior</w:t>
-      </w:r>
-    </w:p>
-    <w:p>
-      <w:r>
-        <w:t>Unchanged: business date = date shop was opened. After-midnight closes use persisted open date; `closedAt` = actual server timestamp.</w:t>
-      </w:r>
-    </w:p>
-    <w:p>
-      <w:r>
-        <w:t>---</w:t>
-      </w:r>
-    </w:p>
-    <w:p>
-      <w:pPr>
-        <w:pStyle w:val="Heading2"/>
-      </w:pPr>
-      <w:r>
-        <w:t>Previous-Day Guard</w:t>
-      </w:r>
-    </w:p>
-    <w:p>
-      <w:r>
-        <w:t>Unchanged: `previous_business_day_open` blocks opening next day while prior day is `open` or `close_requested`. Workflow now provides actionable path: submit → approve → open next day.</w:t>
-      </w:r>
-    </w:p>
-    <w:p>
-      <w:r>
-        <w:t>---</w:t>
-      </w:r>
-    </w:p>
-    <w:p>
-      <w:pPr>
-        <w:pStyle w:val="Heading2"/>
-      </w:pPr>
-      <w:r>
-        <w:t>Error Handling</w:t>
-      </w:r>
-    </w:p>
-    <w:p>
-      <w:r>
-        <w:t>Preserved from `74c5c62`:</w:t>
+        <w:t>Payout sequencing on approve</w:t>
       </w:r>
     </w:p>
     <w:p>
@@ -708,7 +925,7 @@
         <w:pStyle w:val="ListBullet"/>
       </w:pPr>
       <w:r>
-        <w:t>ApiError codes surface human-readable messages</w:t>
+        <w:t>Error code preservation (`74c5c62`)</w:t>
       </w:r>
     </w:p>
     <w:p>
@@ -716,115 +933,7 @@
         <w:pStyle w:val="ListBullet"/>
       </w:pPr>
       <w:r>
-        <w:t>Post-close refresh failures logged, not reported as close failure</w:t>
-      </w:r>
-    </w:p>
-    <w:p>
-      <w:pPr>
-        <w:pStyle w:val="ListBullet"/>
-      </w:pPr>
-      <w:r>
-        <w:t>New codes: `close_request_already_pending`, `close_request_not_pending`, `close_request_pending`</w:t>
-      </w:r>
-    </w:p>
-    <w:p>
-      <w:r>
-        <w:t>---</w:t>
-      </w:r>
-    </w:p>
-    <w:p>
-      <w:pPr>
-        <w:pStyle w:val="Heading2"/>
-      </w:pPr>
-      <w:r>
-        <w:t>Login Credential-Hint Removal</w:t>
-      </w:r>
-    </w:p>
-    <w:p>
-      <w:r>
-        <w:t>Completed in `04b6c90` — no default owner credentials on login page.</w:t>
-      </w:r>
-    </w:p>
-    <w:p>
-      <w:r>
-        <w:t>---</w:t>
-      </w:r>
-    </w:p>
-    <w:p>
-      <w:pPr>
-        <w:pStyle w:val="Heading2"/>
-      </w:pPr>
-      <w:r>
-        <w:t>Tests Run (exact results)</w:t>
-      </w:r>
-    </w:p>
-    <w:p>
-      <w:pPr>
-        <w:pStyle w:val="IntenseQuote"/>
-      </w:pPr>
-      <w:r>
-        <w:t>| Command | Result |</w:t>
-      </w:r>
-    </w:p>
-    <w:p>
-      <w:r>
-        <w:t>|---------|--------|</w:t>
-      </w:r>
-    </w:p>
-    <w:p>
-      <w:pPr>
-        <w:pStyle w:val="IntenseQuote"/>
-      </w:pPr>
-      <w:r>
-        <w:t>| `npx tsc --noEmit` | PASS |</w:t>
-      </w:r>
-    </w:p>
-    <w:p>
-      <w:pPr>
-        <w:pStyle w:val="IntenseQuote"/>
-      </w:pPr>
-      <w:r>
-        <w:t>| `npm run verify:close-request-workflow` | PASS (20/20) |</w:t>
-      </w:r>
-    </w:p>
-    <w:p>
-      <w:pPr>
-        <w:pStyle w:val="IntenseQuote"/>
-      </w:pPr>
-      <w:r>
-        <w:t>| `npm run verify:close-time-flexibility` | PASS (24/24) |</w:t>
-      </w:r>
-    </w:p>
-    <w:p>
-      <w:pPr>
-        <w:pStyle w:val="IntenseQuote"/>
-      </w:pPr>
-      <w:r>
-        <w:t>| `npm run verify:close-day-date` | PASS (16/16) |</w:t>
-      </w:r>
-    </w:p>
-    <w:p>
-      <w:pPr>
-        <w:pStyle w:val="IntenseQuote"/>
-      </w:pPr>
-      <w:r>
-        <w:t>| `npm run verify:final-open-day-guard` | PASS (10/10) |</w:t>
-      </w:r>
-    </w:p>
-    <w:p>
-      <w:pPr>
-        <w:pStyle w:val="IntenseQuote"/>
-      </w:pPr>
-      <w:r>
-        <w:t>| `npm run verify:branch-selection` | PASS |</w:t>
-      </w:r>
-    </w:p>
-    <w:p>
-      <w:pPr>
-        <w:pStyle w:val="IntenseQuote"/>
-      </w:pPr>
-      <w:r>
-        <w:t>| `npm run verify:close-day-payouts` | PASS |</w:t>
+        <w:t>Login page has no default credentials</w:t>
       </w:r>
     </w:p>
     <w:p>
@@ -869,25 +978,7 @@
         <w:pStyle w:val="ListBullet"/>
       </w:pPr>
       <w:r>
-        <w:t>PR #39 not merged</w:t>
-      </w:r>
-    </w:p>
-    <w:p>
-      <w:r>
-        <w:t>---</w:t>
-      </w:r>
-    </w:p>
-    <w:p>
-      <w:pPr>
-        <w:pStyle w:val="Heading2"/>
-      </w:pPr>
-      <w:r>
-        <w:t>Deployment</w:t>
-      </w:r>
-    </w:p>
-    <w:p>
-      <w:r>
-        <w:t>Push branch `cursor/close-shop-ux-fix-b6e7` to origin; Vercel Preview rebuilds automatically.</w:t>
+        <w:t>**PR #39 NOT merged**</w:t>
       </w:r>
     </w:p>
     <w:sectPr>

</xml_diff>